<commit_message>
Correcciones datos y docs s5
</commit_message>
<xml_diff>
--- a/reports/Group/00 - Identification Form.docx
+++ b/reports/Group/00 - Identification Form.docx
@@ -2031,27 +2031,7 @@
                         <w:sz w:val="22"/>
                         <w:szCs w:val="22"/>
                       </w:rPr>
-                      <w:t>Analyst, Developer, Tester, Oper</w:t>
-                    </w:r>
-                    <w:r>
-                      <w:rPr>
-                        <w:rFonts w:asciiTheme="majorHAnsi" w:eastAsia="Calibri" w:hAnsiTheme="majorHAnsi" w:cstheme="majorHAnsi"/>
-                        <w:i/>
-                        <w:iCs/>
-                        <w:sz w:val="22"/>
-                        <w:szCs w:val="22"/>
-                      </w:rPr>
-                      <w:t>a</w:t>
-                    </w:r>
-                    <w:r>
-                      <w:rPr>
-                        <w:rFonts w:asciiTheme="majorHAnsi" w:eastAsia="Calibri" w:hAnsiTheme="majorHAnsi" w:cstheme="majorHAnsi"/>
-                        <w:i/>
-                        <w:iCs/>
-                        <w:sz w:val="22"/>
-                        <w:szCs w:val="22"/>
-                      </w:rPr>
-                      <w:t>tor</w:t>
+                      <w:t>Analyst, Developer, Tester, Operator</w:t>
                     </w:r>
                   </w:p>
                 </w:tc>
@@ -2280,7 +2260,6 @@
             <w:placeholder>
               <w:docPart w:val="07C1E16562F744CDA1108996FDC4506E"/>
             </w:placeholder>
-            <w:showingPlcHdr/>
           </w:sdtPr>
           <w:sdtEndPr/>
           <w:sdtContent>
@@ -2301,15 +2280,23 @@
                 </w:pPr>
                 <w:r>
                   <w:rPr>
-                    <w:rStyle w:val="Textodelmarcadordeposicin"/>
+                    <w:rFonts w:asciiTheme="majorHAnsi" w:eastAsia="Calibri" w:hAnsiTheme="majorHAnsi" w:cstheme="majorHAnsi"/>
                     <w:i/>
                     <w:iCs/>
                     <w:sz w:val="22"/>
                     <w:szCs w:val="22"/>
-                    <w:shd w:val="clear" w:color="auto" w:fill="FFF2CC" w:themeFill="accent4" w:themeFillTint="33"/>
-                    <w:lang w:val="es-ES"/>
                   </w:rPr>
-                  <w:t>Your institutional email</w:t>
+                  <w:t>a</w:t>
+                </w:r>
+                <w:r>
+                  <w:rPr>
+                    <w:rFonts w:asciiTheme="majorHAnsi" w:eastAsia="Calibri" w:hAnsiTheme="majorHAnsi" w:cstheme="majorHAnsi"/>
+                    <w:i/>
+                    <w:iCs/>
+                    <w:sz w:val="22"/>
+                    <w:szCs w:val="22"/>
+                  </w:rPr>
+                  <w:t>lvcarber1@alum.us.es</w:t>
                 </w:r>
               </w:p>
             </w:tc>
@@ -2393,7 +2380,6 @@
             <w:placeholder>
               <w:docPart w:val="A504451A6B544C7BA821505A41F511E6"/>
             </w:placeholder>
-            <w:showingPlcHdr/>
           </w:sdtPr>
           <w:sdtEndPr/>
           <w:sdtContent>
@@ -2414,15 +2400,13 @@
                 </w:pPr>
                 <w:r>
                   <w:rPr>
-                    <w:rStyle w:val="Textodelmarcadordeposicin"/>
+                    <w:rFonts w:asciiTheme="majorHAnsi" w:eastAsia="Calibri" w:hAnsiTheme="majorHAnsi" w:cstheme="majorHAnsi"/>
                     <w:i/>
                     <w:iCs/>
                     <w:sz w:val="22"/>
                     <w:szCs w:val="22"/>
-                    <w:shd w:val="clear" w:color="auto" w:fill="FFF2CC" w:themeFill="accent4" w:themeFillTint="33"/>
-                    <w:lang w:val="es-ES"/>
                   </w:rPr>
-                  <w:t>Your UVUS</w:t>
+                  <w:t>alvcarber1</w:t>
                 </w:r>
               </w:p>
             </w:tc>
@@ -2507,7 +2491,6 @@
             <w:placeholder>
               <w:docPart w:val="8F785ACB1CB0409098930478E3F27483"/>
             </w:placeholder>
-            <w:showingPlcHdr/>
           </w:sdtPr>
           <w:sdtEndPr/>
           <w:sdtContent>
@@ -2528,15 +2511,14 @@
                 </w:pPr>
                 <w:r>
                   <w:rPr>
-                    <w:rStyle w:val="Textodelmarcadordeposicin"/>
+                    <w:rFonts w:asciiTheme="majorHAnsi" w:eastAsia="Calibri" w:hAnsiTheme="majorHAnsi" w:cstheme="majorHAnsi"/>
                     <w:i/>
                     <w:iCs/>
                     <w:sz w:val="22"/>
                     <w:szCs w:val="22"/>
-                    <w:shd w:val="clear" w:color="auto" w:fill="FFF2CC" w:themeFill="accent4" w:themeFillTint="33"/>
                     <w:lang w:val="es-ES"/>
                   </w:rPr>
-                  <w:t>Surname, Name</w:t>
+                  <w:t>Carrera Bernal, Álvaro</w:t>
                 </w:r>
               </w:p>
             </w:tc>
@@ -2640,39 +2622,54 @@
             <w:placeholder>
               <w:docPart w:val="B7591F2B336648E58636ED4C22A5E629"/>
             </w:placeholder>
-            <w:showingPlcHdr/>
           </w:sdtPr>
           <w:sdtEndPr/>
           <w:sdtContent>
-            <w:tc>
-              <w:tcPr>
-                <w:tcW w:w="3237" w:type="dxa"/>
-              </w:tcPr>
-              <w:p>
-                <w:pPr>
-                  <w:spacing w:before="0" w:after="0" w:line="240" w:lineRule="atLeast"/>
-                  <w:rPr>
-                    <w:rFonts w:asciiTheme="majorHAnsi" w:eastAsia="Calibri" w:hAnsiTheme="majorHAnsi" w:cstheme="majorHAnsi"/>
-                    <w:i/>
-                    <w:iCs/>
-                    <w:sz w:val="22"/>
-                    <w:szCs w:val="22"/>
-                  </w:rPr>
-                </w:pPr>
-                <w:r>
-                  <w:rPr>
-                    <w:rStyle w:val="Textodelmarcadordeposicin"/>
-                    <w:i/>
-                    <w:iCs/>
-                    <w:sz w:val="22"/>
-                    <w:szCs w:val="22"/>
-                    <w:shd w:val="clear" w:color="auto" w:fill="FFF2CC" w:themeFill="accent4" w:themeFillTint="33"/>
-                    <w:lang w:val="es-ES"/>
-                  </w:rPr>
-                  <w:t>Roles</w:t>
-                </w:r>
-              </w:p>
-            </w:tc>
+            <w:sdt>
+              <w:sdtPr>
+                <w:rPr>
+                  <w:rFonts w:asciiTheme="majorHAnsi" w:eastAsia="Calibri" w:hAnsiTheme="majorHAnsi" w:cstheme="majorHAnsi"/>
+                  <w:i/>
+                  <w:iCs/>
+                  <w:sz w:val="22"/>
+                  <w:szCs w:val="22"/>
+                </w:rPr>
+                <w:id w:val="950364213"/>
+                <w:placeholder>
+                  <w:docPart w:val="9EF8EF6FEE564CF9A96F59C42C88B8B3"/>
+                </w:placeholder>
+              </w:sdtPr>
+              <w:sdtEndPr/>
+              <w:sdtContent>
+                <w:tc>
+                  <w:tcPr>
+                    <w:tcW w:w="3237" w:type="dxa"/>
+                  </w:tcPr>
+                  <w:p>
+                    <w:pPr>
+                      <w:spacing w:before="0" w:after="0" w:line="240" w:lineRule="atLeast"/>
+                      <w:rPr>
+                        <w:rFonts w:asciiTheme="majorHAnsi" w:eastAsia="Calibri" w:hAnsiTheme="majorHAnsi" w:cstheme="majorHAnsi"/>
+                        <w:i/>
+                        <w:iCs/>
+                        <w:sz w:val="22"/>
+                        <w:szCs w:val="22"/>
+                      </w:rPr>
+                    </w:pPr>
+                    <w:r>
+                      <w:rPr>
+                        <w:rFonts w:asciiTheme="majorHAnsi" w:eastAsia="Calibri" w:hAnsiTheme="majorHAnsi" w:cstheme="majorHAnsi"/>
+                        <w:i/>
+                        <w:iCs/>
+                        <w:sz w:val="22"/>
+                        <w:szCs w:val="22"/>
+                      </w:rPr>
+                      <w:t>Analyst, Developer, Tester, Operator</w:t>
+                    </w:r>
+                  </w:p>
+                </w:tc>
+              </w:sdtContent>
+            </w:sdt>
           </w:sdtContent>
         </w:sdt>
         <w:tc>
@@ -5452,6 +5449,37 @@
         </w:p>
       </w:docPartBody>
     </w:docPart>
+    <w:docPart>
+      <w:docPartPr>
+        <w:name w:val="9EF8EF6FEE564CF9A96F59C42C88B8B3"/>
+        <w:category>
+          <w:name w:val="General"/>
+          <w:gallery w:val="placeholder"/>
+        </w:category>
+        <w:types>
+          <w:type w:val="bbPlcHdr"/>
+        </w:types>
+        <w:behaviors>
+          <w:behavior w:val="content"/>
+        </w:behaviors>
+        <w:guid w:val="{34DC799C-51CC-4F32-A8FF-B5BCC3A7FD2B}"/>
+      </w:docPartPr>
+      <w:docPartBody>
+        <w:p>
+          <w:pPr>
+            <w:pStyle w:val="9EF8EF6FEE564CF9A96F59C42C88B8B3"/>
+          </w:pPr>
+          <w:r>
+            <w:rPr>
+              <w:rStyle w:val="Textodelmarcadordeposicin"/>
+              <w:i/>
+              <w:iCs/>
+            </w:rPr>
+            <w:t>Roles</w:t>
+          </w:r>
+        </w:p>
+      </w:docPartBody>
+    </w:docPart>
   </w:docParts>
 </w:glossaryDocument>
 </file>
@@ -5530,7 +5558,6 @@
     <w:sig w:usb0="20000287" w:usb1="00000003" w:usb2="00000000" w:usb3="00000000" w:csb0="0000019F" w:csb1="00000000"/>
   </w:font>
   <w:font w:name="Yu Mincho">
-    <w:altName w:val="游明朝"/>
     <w:charset w:val="80"/>
     <w:family w:val="roman"/>
     <w:pitch w:val="variable"/>
@@ -5570,6 +5597,7 @@
     <w:rsid w:val="00213D82"/>
     <w:rsid w:val="00294E6A"/>
     <w:rsid w:val="00314F21"/>
+    <w:rsid w:val="003D39A6"/>
     <w:rsid w:val="004C28F8"/>
     <w:rsid w:val="004E5FFD"/>
     <w:rsid w:val="00620AAC"/>
@@ -5579,6 +5607,8 @@
     <w:rsid w:val="007D1597"/>
     <w:rsid w:val="007D7582"/>
     <w:rsid w:val="00807725"/>
+    <w:rsid w:val="00813A3C"/>
+    <w:rsid w:val="00823160"/>
     <w:rsid w:val="00825E07"/>
     <w:rsid w:val="008E2BE8"/>
     <w:rsid w:val="009677E8"/>
@@ -6052,7 +6082,7 @@
     <w:basedOn w:val="Fuentedeprrafopredeter"/>
     <w:uiPriority w:val="99"/>
     <w:semiHidden/>
-    <w:rsid w:val="00AA3585"/>
+    <w:rsid w:val="00823160"/>
     <w:rPr>
       <w:color w:val="808080"/>
     </w:rPr>
@@ -6351,6 +6381,13 @@
   <w:style w:type="paragraph" w:customStyle="1" w:styleId="168EBC13044C442E9CB42975F244031C">
     <w:name w:val="168EBC13044C442E9CB42975F244031C"/>
     <w:rsid w:val="00AA3585"/>
+    <w:rPr>
+      <w:lang w:val="es-ES" w:eastAsia="es-ES"/>
+    </w:rPr>
+  </w:style>
+  <w:style w:type="paragraph" w:customStyle="1" w:styleId="9EF8EF6FEE564CF9A96F59C42C88B8B3">
+    <w:name w:val="9EF8EF6FEE564CF9A96F59C42C88B8B3"/>
+    <w:rsid w:val="00823160"/>
     <w:rPr>
       <w:lang w:val="es-ES" w:eastAsia="es-ES"/>
     </w:rPr>

</xml_diff>

<commit_message>
added date identificaciaon form
</commit_message>
<xml_diff>
--- a/reports/Group/00 - Identification Form.docx
+++ b/reports/Group/00 - Identification Form.docx
@@ -482,7 +482,6 @@
                   <w:docPart w:val="86462A3115F240619C10F4371A2E6A3E"/>
                 </w:placeholder>
               </w:sdtPr>
-              <w:sdtEndPr/>
               <w:sdtContent>
                 <w:r>
                   <w:rPr>
@@ -619,7 +618,6 @@
               <w:docPart w:val="87A87B68081E4C51824181939A8312B9"/>
             </w:placeholder>
           </w:sdtPr>
-          <w:sdtEndPr/>
           <w:sdtContent>
             <w:tc>
               <w:tcPr>
@@ -696,7 +694,6 @@
               <w:docPart w:val="6EEE99372F0D4FB5A03EB0BDF6AF76C7"/>
             </w:placeholder>
           </w:sdtPr>
-          <w:sdtEndPr/>
           <w:sdtContent>
             <w:tc>
               <w:tcPr>
@@ -782,7 +779,6 @@
               <w:docPart w:val="A62D95033FBF4F108A16844BF9735A65"/>
             </w:placeholder>
           </w:sdtPr>
-          <w:sdtEndPr/>
           <w:sdtContent>
             <w:tc>
               <w:tcPr>
@@ -800,7 +796,6 @@
                     <w:lang w:val="es-ES"/>
                   </w:rPr>
                 </w:pPr>
-                <w:proofErr w:type="spellStart"/>
                 <w:r>
                   <w:rPr>
                     <w:rFonts w:asciiTheme="majorHAnsi" w:eastAsia="Calibri" w:hAnsiTheme="majorHAnsi" w:cstheme="majorHAnsi"/>
@@ -811,7 +806,6 @@
                   </w:rPr>
                   <w:t>nerjimado</w:t>
                 </w:r>
-                <w:proofErr w:type="spellEnd"/>
               </w:p>
             </w:tc>
           </w:sdtContent>
@@ -865,7 +859,6 @@
               <w:docPart w:val="82942A0EA77541EF928400BF197CB291"/>
             </w:placeholder>
           </w:sdtPr>
-          <w:sdtEndPr/>
           <w:sdtContent>
             <w:tc>
               <w:tcPr>
@@ -883,7 +876,6 @@
                     <w:lang w:val="es-ES"/>
                   </w:rPr>
                 </w:pPr>
-                <w:proofErr w:type="spellStart"/>
                 <w:r>
                   <w:rPr>
                     <w:rFonts w:asciiTheme="majorHAnsi" w:eastAsia="Calibri" w:hAnsiTheme="majorHAnsi" w:cstheme="majorHAnsi"/>
@@ -894,7 +886,6 @@
                   </w:rPr>
                   <w:t>rafseggom</w:t>
                 </w:r>
-                <w:proofErr w:type="spellEnd"/>
               </w:p>
             </w:tc>
           </w:sdtContent>
@@ -951,7 +942,6 @@
               <w:docPart w:val="4837284C9B7146B5BB29B30A3C2E7BEE"/>
             </w:placeholder>
           </w:sdtPr>
-          <w:sdtEndPr/>
           <w:sdtContent>
             <w:tc>
               <w:tcPr>
@@ -1032,7 +1022,6 @@
               <w:docPart w:val="1D4305A9657A4581875BF2F5A67E0B98"/>
             </w:placeholder>
           </w:sdtPr>
-          <w:sdtEndPr/>
           <w:sdtContent>
             <w:tc>
               <w:tcPr>
@@ -1138,7 +1127,6 @@
               <w:docPart w:val="A7AE45289F684C248633B8ED2BC66CB9"/>
             </w:placeholder>
           </w:sdtPr>
-          <w:sdtEndPr/>
           <w:sdtContent>
             <w:tc>
               <w:tcPr>
@@ -1239,7 +1227,6 @@
               <w:docPart w:val="4AB32200232041A5AAE9D047CBEFE3E7"/>
             </w:placeholder>
           </w:sdtPr>
-          <w:sdtEndPr/>
           <w:sdtContent>
             <w:sdt>
               <w:sdtPr>
@@ -1255,7 +1242,6 @@
                   <w:docPart w:val="F55A18C6AD284842B13B797913777201"/>
                 </w:placeholder>
               </w:sdtPr>
-              <w:sdtEndPr/>
               <w:sdtContent>
                 <w:tc>
                   <w:tcPr>
@@ -1438,7 +1424,6 @@
               <w:docPart w:val="F3B073C01B5E457BA242F3CFEED75BE3"/>
             </w:placeholder>
           </w:sdtPr>
-          <w:sdtEndPr/>
           <w:sdtContent>
             <w:tc>
               <w:tcPr>
@@ -1540,7 +1525,6 @@
             </w:placeholder>
             <w:showingPlcHdr/>
           </w:sdtPr>
-          <w:sdtEndPr/>
           <w:sdtContent>
             <w:tc>
               <w:tcPr>
@@ -1628,7 +1612,6 @@
               <w:docPart w:val="CD2BC451BDF8405EBE3ACC7EDD7D3E98"/>
             </w:placeholder>
           </w:sdtPr>
-          <w:sdtEndPr/>
           <w:sdtContent>
             <w:tc>
               <w:tcPr>
@@ -1710,7 +1693,6 @@
             </w:placeholder>
             <w:showingPlcHdr/>
           </w:sdtPr>
-          <w:sdtEndPr/>
           <w:sdtContent>
             <w:tc>
               <w:tcPr>
@@ -1798,7 +1780,6 @@
               <w:docPart w:val="6EC4D74791DA4F97949C707E193398CF"/>
             </w:placeholder>
           </w:sdtPr>
-          <w:sdtEndPr/>
           <w:sdtContent>
             <w:tc>
               <w:tcPr>
@@ -1881,7 +1862,6 @@
             </w:placeholder>
             <w:showingPlcHdr/>
           </w:sdtPr>
-          <w:sdtEndPr/>
           <w:sdtContent>
             <w:tc>
               <w:tcPr>
@@ -1989,7 +1969,6 @@
               <w:docPart w:val="6B5FFBB2718245888FF8C980710E55F7"/>
             </w:placeholder>
           </w:sdtPr>
-          <w:sdtEndPr/>
           <w:sdtContent>
             <w:sdt>
               <w:sdtPr>
@@ -2005,7 +1984,6 @@
                   <w:docPart w:val="168EBC13044C442E9CB42975F244031C"/>
                 </w:placeholder>
               </w:sdtPr>
-              <w:sdtEndPr/>
               <w:sdtContent>
                 <w:tc>
                   <w:tcPr>
@@ -2109,7 +2087,6 @@
             </w:placeholder>
             <w:showingPlcHdr/>
           </w:sdtPr>
-          <w:sdtEndPr/>
           <w:sdtContent>
             <w:tc>
               <w:tcPr>
@@ -2261,7 +2238,6 @@
               <w:docPart w:val="07C1E16562F744CDA1108996FDC4506E"/>
             </w:placeholder>
           </w:sdtPr>
-          <w:sdtEndPr/>
           <w:sdtContent>
             <w:tc>
               <w:tcPr>
@@ -2381,7 +2357,6 @@
               <w:docPart w:val="A504451A6B544C7BA821505A41F511E6"/>
             </w:placeholder>
           </w:sdtPr>
-          <w:sdtEndPr/>
           <w:sdtContent>
             <w:tc>
               <w:tcPr>
@@ -2492,7 +2467,6 @@
               <w:docPart w:val="8F785ACB1CB0409098930478E3F27483"/>
             </w:placeholder>
           </w:sdtPr>
-          <w:sdtEndPr/>
           <w:sdtContent>
             <w:tc>
               <w:tcPr>
@@ -2623,7 +2597,6 @@
               <w:docPart w:val="B7591F2B336648E58636ED4C22A5E629"/>
             </w:placeholder>
           </w:sdtPr>
-          <w:sdtEndPr/>
           <w:sdtContent>
             <w:sdt>
               <w:sdtPr>
@@ -2639,7 +2612,6 @@
                   <w:docPart w:val="9EF8EF6FEE564CF9A96F59C42C88B8B3"/>
                 </w:placeholder>
               </w:sdtPr>
-              <w:sdtEndPr/>
               <w:sdtContent>
                 <w:tc>
                   <w:tcPr>
@@ -2770,21 +2742,18 @@
                 <w:placeholder>
                   <w:docPart w:val="3843AF8B4938474BBDDF97FF967628A8"/>
                 </w:placeholder>
-                <w:showingPlcHdr/>
               </w:sdtPr>
-              <w:sdtEndPr/>
               <w:sdtContent>
                 <w:r>
                   <w:rPr>
-                    <w:rStyle w:val="Textodelmarcadordeposicin"/>
+                    <w:rFonts w:asciiTheme="majorHAnsi" w:eastAsia="Calibri Light" w:hAnsiTheme="majorHAnsi" w:cstheme="majorHAnsi"/>
                     <w:i/>
                     <w:iCs/>
                     <w:sz w:val="22"/>
                     <w:szCs w:val="22"/>
-                    <w:shd w:val="clear" w:color="auto" w:fill="FFF2CC" w:themeFill="accent4" w:themeFillTint="33"/>
-                    <w:lang w:val="en-US"/>
+                    <w:lang w:val="es-ES"/>
                   </w:rPr>
-                  <w:t>Place month day, year</w:t>
+                  <w:t>Sevilla February 9th, 2026</w:t>
                 </w:r>
               </w:sdtContent>
             </w:sdt>
@@ -5610,6 +5579,7 @@
     <w:rsid w:val="00813A3C"/>
     <w:rsid w:val="00823160"/>
     <w:rsid w:val="00825E07"/>
+    <w:rsid w:val="00837F41"/>
     <w:rsid w:val="008E2BE8"/>
     <w:rsid w:val="009677E8"/>
     <w:rsid w:val="00976D04"/>
@@ -5627,6 +5597,7 @@
     <w:rsid w:val="00DD76BC"/>
     <w:rsid w:val="00E566B1"/>
     <w:rsid w:val="00E77A2D"/>
+    <w:rsid w:val="00EF657C"/>
   </w:rsids>
   <m:mathPr>
     <m:mathFont m:val="Cambria Math"/>

</xml_diff>